<commit_message>
Update Word report template with VTB image tag
</commit_message>
<xml_diff>
--- a/public/Fatal_RTA_Report_Template.docx
+++ b/public/Fatal_RTA_Report_Template.docx
@@ -180,43 +180,7 @@
           <w:sz w:val="24"/>
           <w:szCs w:val="24"/>
         </w:rPr>
-        <w:t xml:space="preserve">A </w:t>
-      </w:r>
-      <w:r>
-        <w:rPr>
-          <w:b/>
-          <w:bCs/>
-          <w:sz w:val="24"/>
-          <w:szCs w:val="24"/>
-        </w:rPr>
-        <w:t xml:space="preserve">[VEHICLE </w:t>
-      </w:r>
-      <w:r>
-        <w:rPr>
-          <w:b/>
-          <w:bCs/>
-          <w:sz w:val="24"/>
-          <w:szCs w:val="24"/>
-        </w:rPr>
-        <w:t>2</w:t>
-      </w:r>
-      <w:r>
-        <w:rPr>
-          <w:b/>
-          <w:bCs/>
-          <w:sz w:val="24"/>
-          <w:szCs w:val="24"/>
-        </w:rPr>
-        <w:t xml:space="preserve"> MAKE/TYPE]</w:t>
-      </w:r>
-      <w:r>
-        <w:rPr>
-          <w:b/>
-          <w:bCs/>
-          <w:sz w:val="24"/>
-          <w:szCs w:val="24"/>
-        </w:rPr>
-        <w:t xml:space="preserve"> </w:t>
+        <w:t xml:space="preserve">A [VEHICLE 2 MAKE/TYPE] </w:t>
       </w:r>
       <w:r>
         <w:rPr>
@@ -3582,6 +3546,157 @@
       <w:pPr>
         <w:rPr>
           <w:rStyle w:val="IntenseEmphasis"/>
+          <w:i w:val="0"/>
+          <w:iCs w:val="0"/>
+          <w:sz w:val="18"/>
+          <w:szCs w:val="18"/>
+        </w:rPr>
+      </w:pPr>
+    </w:p>
+    <w:p>
+      <w:pPr>
+        <w:rPr>
+          <w:rStyle w:val="IntenseEmphasis"/>
+          <w:i w:val="0"/>
+          <w:iCs w:val="0"/>
+          <w:sz w:val="18"/>
+          <w:szCs w:val="18"/>
+        </w:rPr>
+      </w:pPr>
+    </w:p>
+    <w:p>
+      <w:pPr>
+        <w:rPr>
+          <w:rStyle w:val="IntenseEmphasis"/>
+          <w:i w:val="0"/>
+          <w:iCs w:val="0"/>
+          <w:sz w:val="18"/>
+          <w:szCs w:val="18"/>
+        </w:rPr>
+      </w:pPr>
+      <w:r>
+        <w:rPr>
+          <w:rStyle w:val="IntenseEmphasis"/>
+          <w:i w:val="0"/>
+          <w:iCs w:val="0"/>
+          <w:sz w:val="18"/>
+          <w:szCs w:val="18"/>
+        </w:rPr>
+        <w:t>[%VTB_PHOTO]</w:t>
+      </w:r>
+    </w:p>
+    <w:p>
+      <w:pPr>
+        <w:rPr>
+          <w:rStyle w:val="IntenseEmphasis"/>
+          <w:sz w:val="18"/>
+          <w:szCs w:val="18"/>
+        </w:rPr>
+      </w:pPr>
+    </w:p>
+    <w:p>
+      <w:pPr>
+        <w:rPr>
+          <w:rStyle w:val="IntenseEmphasis"/>
+          <w:sz w:val="18"/>
+          <w:szCs w:val="18"/>
+        </w:rPr>
+      </w:pPr>
+    </w:p>
+    <w:p>
+      <w:pPr>
+        <w:rPr>
+          <w:rStyle w:val="IntenseEmphasis"/>
+          <w:sz w:val="18"/>
+          <w:szCs w:val="18"/>
+        </w:rPr>
+      </w:pPr>
+    </w:p>
+    <w:p>
+      <w:pPr>
+        <w:rPr>
+          <w:rStyle w:val="IntenseEmphasis"/>
+          <w:sz w:val="18"/>
+          <w:szCs w:val="18"/>
+        </w:rPr>
+      </w:pPr>
+    </w:p>
+    <w:p>
+      <w:pPr>
+        <w:rPr>
+          <w:rStyle w:val="IntenseEmphasis"/>
+          <w:sz w:val="18"/>
+          <w:szCs w:val="18"/>
+        </w:rPr>
+      </w:pPr>
+    </w:p>
+    <w:p>
+      <w:pPr>
+        <w:rPr>
+          <w:rStyle w:val="IntenseEmphasis"/>
+          <w:sz w:val="18"/>
+          <w:szCs w:val="18"/>
+        </w:rPr>
+      </w:pPr>
+    </w:p>
+    <w:p>
+      <w:pPr>
+        <w:rPr>
+          <w:rStyle w:val="IntenseEmphasis"/>
+          <w:sz w:val="18"/>
+          <w:szCs w:val="18"/>
+        </w:rPr>
+      </w:pPr>
+    </w:p>
+    <w:p>
+      <w:pPr>
+        <w:rPr>
+          <w:rStyle w:val="IntenseEmphasis"/>
+          <w:sz w:val="18"/>
+          <w:szCs w:val="18"/>
+        </w:rPr>
+      </w:pPr>
+    </w:p>
+    <w:p>
+      <w:pPr>
+        <w:rPr>
+          <w:rStyle w:val="IntenseEmphasis"/>
+          <w:sz w:val="18"/>
+          <w:szCs w:val="18"/>
+        </w:rPr>
+      </w:pPr>
+    </w:p>
+    <w:p>
+      <w:pPr>
+        <w:rPr>
+          <w:rStyle w:val="IntenseEmphasis"/>
+          <w:sz w:val="18"/>
+          <w:szCs w:val="18"/>
+        </w:rPr>
+      </w:pPr>
+    </w:p>
+    <w:p>
+      <w:pPr>
+        <w:rPr>
+          <w:rStyle w:val="IntenseEmphasis"/>
+          <w:sz w:val="18"/>
+          <w:szCs w:val="18"/>
+        </w:rPr>
+      </w:pPr>
+    </w:p>
+    <w:p>
+      <w:pPr>
+        <w:rPr>
+          <w:rStyle w:val="IntenseEmphasis"/>
+          <w:sz w:val="18"/>
+          <w:szCs w:val="18"/>
+        </w:rPr>
+      </w:pPr>
+    </w:p>
+    <w:p>
+      <w:pPr>
+        <w:rPr>
+          <w:rStyle w:val="IntenseEmphasis"/>
           <w:sz w:val="18"/>
           <w:szCs w:val="18"/>
         </w:rPr>
@@ -3883,37 +3998,6 @@
           <w:szCs w:val="18"/>
         </w:rPr>
       </w:pPr>
-    </w:p>
-    <w:p>
-      <w:pPr>
-        <w:rPr>
-          <w:noProof/>
-          <w:sz w:val="18"/>
-          <w:szCs w:val="18"/>
-        </w:rPr>
-      </w:pPr>
-      <w:proofErr w:type="gramStart"/>
-      <w:r>
-        <w:rPr>
-          <w:b/>
-          <w:bCs/>
-          <w:color w:val="365F91"/>
-          <w:sz w:val="24"/>
-          <w:szCs w:val="24"/>
-        </w:rPr>
-        <w:t>ii .Photographic</w:t>
-      </w:r>
-      <w:proofErr w:type="gramEnd"/>
-      <w:r>
-        <w:rPr>
-          <w:b/>
-          <w:bCs/>
-          <w:color w:val="365F91"/>
-          <w:sz w:val="24"/>
-          <w:szCs w:val="24"/>
-        </w:rPr>
-        <w:t xml:space="preserve"> Evidence Related to the  Motor vehicle (Trailer)</w:t>
-      </w:r>
     </w:p>
     <w:p>
       <w:pPr>

</xml_diff>

<commit_message>
Update on report template
</commit_message>
<xml_diff>
--- a/public/Fatal_RTA_Report_Template.docx
+++ b/public/Fatal_RTA_Report_Template.docx
@@ -2,31 +2,6 @@
 <file path=word/document.xml><?xml version="1.0" encoding="utf-8"?>
 <w:document xmlns:wpc="http://schemas.microsoft.com/office/word/2010/wordprocessingCanvas" xmlns:cx="http://schemas.microsoft.com/office/drawing/2014/chartex" xmlns:cx1="http://schemas.microsoft.com/office/drawing/2015/9/8/chartex" xmlns:cx2="http://schemas.microsoft.com/office/drawing/2015/10/21/chartex" xmlns:cx3="http://schemas.microsoft.com/office/drawing/2016/5/9/chartex" xmlns:cx4="http://schemas.microsoft.com/office/drawing/2016/5/10/chartex" xmlns:cx5="http://schemas.microsoft.com/office/drawing/2016/5/11/chartex" xmlns:cx6="http://schemas.microsoft.com/office/drawing/2016/5/12/chartex" xmlns:cx7="http://schemas.microsoft.com/office/drawing/2016/5/13/chartex" xmlns:cx8="http://schemas.microsoft.com/office/drawing/2016/5/14/chartex" xmlns:mc="http://schemas.openxmlformats.org/markup-compatibility/2006" xmlns:aink="http://schemas.microsoft.com/office/drawing/2016/ink" xmlns:am3d="http://schemas.microsoft.com/office/drawing/2017/model3d" xmlns:o="urn:schemas-microsoft-com:office:office" xmlns:r="http://schemas.openxmlformats.org/officeDocument/2006/relationships" xmlns:m="http://schemas.openxmlformats.org/officeDocument/2006/math" xmlns:v="urn:schemas-microsoft-com:vml" xmlns:wp14="http://schemas.microsoft.com/office/word/2010/wordprocessingDrawing" xmlns:wp="http://schemas.openxmlformats.org/drawingml/2006/wordprocessingDrawing" xmlns:w10="urn:schemas-microsoft-com:office:word" xmlns:w="http://schemas.openxmlformats.org/wordprocessingml/2006/main" xmlns:w14="http://schemas.microsoft.com/office/word/2010/wordml" xmlns:w15="http://schemas.microsoft.com/office/word/2012/wordml" xmlns:w16cex="http://schemas.microsoft.com/office/word/2018/wordml/cex" xmlns:w16cid="http://schemas.microsoft.com/office/word/2016/wordml/cid" xmlns:w16="http://schemas.microsoft.com/office/word/2018/wordml" xmlns:w16sdtdh="http://schemas.microsoft.com/office/word/2020/wordml/sdtdatahash" xmlns:w16se="http://schemas.microsoft.com/office/word/2015/wordml/symex" xmlns:wpg="http://schemas.microsoft.com/office/word/2010/wordprocessingGroup" xmlns:wpi="http://schemas.microsoft.com/office/word/2010/wordprocessingInk" xmlns:wne="http://schemas.microsoft.com/office/word/2006/wordml" xmlns:wps="http://schemas.microsoft.com/office/word/2010/wordprocessingShape" mc:Ignorable="w14 w15 w16se w16cid w16 w16cex w16sdtdh wp14">
   <w:body>
-    <w:p>
-      <w:pPr>
-        <w:pStyle w:val="ListParagraph"/>
-      </w:pPr>
-      <w:bookmarkStart w:id="0" w:name="_Hlk206668567"/>
-      <w:bookmarkEnd w:id="0"/>
-      <w:r>
-        <w:t xml:space="preserve"> </w:t>
-      </w:r>
-    </w:p>
-    <w:p>
-      <w:pPr>
-        <w:spacing w:line="484" w:lineRule="auto"/>
-        <w:ind w:left="120" w:firstLine="5"/>
-        <w:rPr>
-          <w:b/>
-        </w:rPr>
-      </w:pPr>
-      <w:r>
-        <w:rPr>
-          <w:b/>
-        </w:rPr>
-        <w:t>[STATION / V.I.C NAME]</w:t>
-      </w:r>
-    </w:p>
     <w:p>
       <w:r>
         <w:t xml:space="preserve">                                                                                                                                      Date:</w:t>
@@ -81,30 +56,32 @@
     </w:p>
     <w:p>
       <w:pPr>
+        <w:spacing w:line="484" w:lineRule="auto"/>
+        <w:rPr>
+          <w:b/>
+        </w:rPr>
+      </w:pPr>
+      <w:r>
         <w:rPr>
           <w:b/>
           <w:bCs/>
           <w:sz w:val="24"/>
           <w:szCs w:val="24"/>
         </w:rPr>
-      </w:pPr>
+        <w:t xml:space="preserve">REF: </w:t>
+      </w:r>
       <w:r>
         <w:rPr>
           <w:b/>
-          <w:bCs/>
-          <w:sz w:val="24"/>
-          <w:szCs w:val="24"/>
-        </w:rPr>
-        <w:t>REF: [TRAFFIC BASE]</w:t>
+        </w:rPr>
+        <w:t>[STATION / V.I.C NAME]</w:t>
       </w:r>
     </w:p>
     <w:p>
       <w:pPr>
+        <w:spacing w:line="484" w:lineRule="auto"/>
         <w:rPr>
           <w:b/>
-          <w:bCs/>
-          <w:sz w:val="24"/>
-          <w:szCs w:val="24"/>
         </w:rPr>
       </w:pPr>
       <w:r>
@@ -1709,449 +1686,6 @@
       <w:pPr>
         <w:pStyle w:val="Heading2"/>
       </w:pPr>
-      <w:r>
-        <w:t xml:space="preserve">Table </w:t>
-      </w:r>
-      <w:r>
-        <w:t xml:space="preserve">3.3: </w:t>
-      </w:r>
-      <w:r>
-        <w:t>Motor Vehicle Details ([</w:t>
-      </w:r>
-      <w:r>
-        <w:t xml:space="preserve">VEHICLE 3 </w:t>
-      </w:r>
-      <w:r>
-        <w:t>REG</w:t>
-      </w:r>
-      <w:r>
-        <w:t xml:space="preserve"> </w:t>
-      </w:r>
-      <w:r>
-        <w:t>NO])</w:t>
-      </w:r>
-    </w:p>
-    <w:tbl>
-      <w:tblPr>
-        <w:tblStyle w:val="PlainTable11"/>
-        <w:tblW w:w="9199" w:type="dxa"/>
-        <w:tblInd w:w="175" w:type="dxa"/>
-        <w:tblLook w:val="04A0" w:firstRow="1" w:lastRow="0" w:firstColumn="1" w:lastColumn="0" w:noHBand="0" w:noVBand="1"/>
-      </w:tblPr>
-      <w:tblGrid>
-        <w:gridCol w:w="4512"/>
-        <w:gridCol w:w="4687"/>
-      </w:tblGrid>
-      <w:tr>
-        <w:trPr>
-          <w:cnfStyle w:val="100000000000" w:firstRow="1" w:lastRow="0" w:firstColumn="0" w:lastColumn="0" w:oddVBand="0" w:evenVBand="0" w:oddHBand="0" w:evenHBand="0" w:firstRowFirstColumn="0" w:firstRowLastColumn="0" w:lastRowFirstColumn="0" w:lastRowLastColumn="0"/>
-          <w:trHeight w:val="288"/>
-        </w:trPr>
-        <w:tc>
-          <w:tcPr>
-            <w:cnfStyle w:val="001000000000" w:firstRow="0" w:lastRow="0" w:firstColumn="1" w:lastColumn="0" w:oddVBand="0" w:evenVBand="0" w:oddHBand="0" w:evenHBand="0" w:firstRowFirstColumn="0" w:firstRowLastColumn="0" w:lastRowFirstColumn="0" w:lastRowLastColumn="0"/>
-            <w:tcW w:w="4512" w:type="dxa"/>
-          </w:tcPr>
-          <w:p>
-            <w:pPr>
-              <w:widowControl w:val="0"/>
-              <w:rPr>
-                <w:b w:val="0"/>
-                <w:bCs w:val="0"/>
-              </w:rPr>
-            </w:pPr>
-            <w:r>
-              <w:rPr>
-                <w:b w:val="0"/>
-                <w:bCs w:val="0"/>
-              </w:rPr>
-              <w:t>Registered Owner</w:t>
-            </w:r>
-          </w:p>
-        </w:tc>
-        <w:tc>
-          <w:tcPr>
-            <w:tcW w:w="4687" w:type="dxa"/>
-          </w:tcPr>
-          <w:p>
-            <w:pPr>
-              <w:cnfStyle w:val="100000000000" w:firstRow="1" w:lastRow="0" w:firstColumn="0" w:lastColumn="0" w:oddVBand="0" w:evenVBand="0" w:oddHBand="0" w:evenHBand="0" w:firstRowFirstColumn="0" w:firstRowLastColumn="0" w:lastRowFirstColumn="0" w:lastRowLastColumn="0"/>
-            </w:pPr>
-            <w:r>
-              <w:rPr>
-                <w:b w:val="0"/>
-                <w:bCs w:val="0"/>
-              </w:rPr>
-              <w:t>[VEHICLE 3 OWNER NAME]</w:t>
-            </w:r>
-          </w:p>
-        </w:tc>
-      </w:tr>
-      <w:tr>
-        <w:trPr>
-          <w:cnfStyle w:val="000000100000" w:firstRow="0" w:lastRow="0" w:firstColumn="0" w:lastColumn="0" w:oddVBand="0" w:evenVBand="0" w:oddHBand="1" w:evenHBand="0" w:firstRowFirstColumn="0" w:firstRowLastColumn="0" w:lastRowFirstColumn="0" w:lastRowLastColumn="0"/>
-          <w:trHeight w:val="271"/>
-        </w:trPr>
-        <w:tc>
-          <w:tcPr>
-            <w:cnfStyle w:val="001000000000" w:firstRow="0" w:lastRow="0" w:firstColumn="1" w:lastColumn="0" w:oddVBand="0" w:evenVBand="0" w:oddHBand="0" w:evenHBand="0" w:firstRowFirstColumn="0" w:firstRowLastColumn="0" w:lastRowFirstColumn="0" w:lastRowLastColumn="0"/>
-            <w:tcW w:w="4512" w:type="dxa"/>
-          </w:tcPr>
-          <w:p>
-            <w:pPr>
-              <w:widowControl w:val="0"/>
-              <w:rPr>
-                <w:b w:val="0"/>
-                <w:bCs w:val="0"/>
-              </w:rPr>
-            </w:pPr>
-            <w:r>
-              <w:rPr>
-                <w:b w:val="0"/>
-                <w:bCs w:val="0"/>
-              </w:rPr>
-              <w:t xml:space="preserve">SACCO </w:t>
-            </w:r>
-          </w:p>
-        </w:tc>
-        <w:tc>
-          <w:tcPr>
-            <w:tcW w:w="4687" w:type="dxa"/>
-          </w:tcPr>
-          <w:p>
-            <w:pPr>
-              <w:cnfStyle w:val="000000100000" w:firstRow="0" w:lastRow="0" w:firstColumn="0" w:lastColumn="0" w:oddVBand="0" w:evenVBand="0" w:oddHBand="1" w:evenHBand="0" w:firstRowFirstColumn="0" w:firstRowLastColumn="0" w:lastRowFirstColumn="0" w:lastRowLastColumn="0"/>
-            </w:pPr>
-            <w:r>
-              <w:t>[VEHICLE 3 SACCO]</w:t>
-            </w:r>
-          </w:p>
-        </w:tc>
-      </w:tr>
-      <w:tr>
-        <w:trPr>
-          <w:trHeight w:val="560"/>
-        </w:trPr>
-        <w:tc>
-          <w:tcPr>
-            <w:cnfStyle w:val="001000000000" w:firstRow="0" w:lastRow="0" w:firstColumn="1" w:lastColumn="0" w:oddVBand="0" w:evenVBand="0" w:oddHBand="0" w:evenHBand="0" w:firstRowFirstColumn="0" w:firstRowLastColumn="0" w:lastRowFirstColumn="0" w:lastRowLastColumn="0"/>
-            <w:tcW w:w="4512" w:type="dxa"/>
-          </w:tcPr>
-          <w:p>
-            <w:pPr>
-              <w:widowControl w:val="0"/>
-              <w:rPr>
-                <w:b w:val="0"/>
-                <w:bCs w:val="0"/>
-              </w:rPr>
-            </w:pPr>
-            <w:r>
-              <w:rPr>
-                <w:b w:val="0"/>
-                <w:bCs w:val="0"/>
-              </w:rPr>
-              <w:t>Make, Model &amp; Type</w:t>
-            </w:r>
-          </w:p>
-        </w:tc>
-        <w:tc>
-          <w:tcPr>
-            <w:tcW w:w="4687" w:type="dxa"/>
-          </w:tcPr>
-          <w:p>
-            <w:pPr>
-              <w:cnfStyle w:val="000000000000" w:firstRow="0" w:lastRow="0" w:firstColumn="0" w:lastColumn="0" w:oddVBand="0" w:evenVBand="0" w:oddHBand="0" w:evenHBand="0" w:firstRowFirstColumn="0" w:firstRowLastColumn="0" w:lastRowFirstColumn="0" w:lastRowLastColumn="0"/>
-            </w:pPr>
-            <w:r>
-              <w:t>[VEHICLE 3 MAKE_MODEL]</w:t>
-            </w:r>
-          </w:p>
-        </w:tc>
-      </w:tr>
-      <w:tr>
-        <w:trPr>
-          <w:cnfStyle w:val="000000100000" w:firstRow="0" w:lastRow="0" w:firstColumn="0" w:lastColumn="0" w:oddVBand="0" w:evenVBand="0" w:oddHBand="1" w:evenHBand="0" w:firstRowFirstColumn="0" w:firstRowLastColumn="0" w:lastRowFirstColumn="0" w:lastRowLastColumn="0"/>
-          <w:trHeight w:val="866"/>
-        </w:trPr>
-        <w:tc>
-          <w:tcPr>
-            <w:cnfStyle w:val="001000000000" w:firstRow="0" w:lastRow="0" w:firstColumn="1" w:lastColumn="0" w:oddVBand="0" w:evenVBand="0" w:oddHBand="0" w:evenHBand="0" w:firstRowFirstColumn="0" w:firstRowLastColumn="0" w:lastRowFirstColumn="0" w:lastRowLastColumn="0"/>
-            <w:tcW w:w="4512" w:type="dxa"/>
-          </w:tcPr>
-          <w:p>
-            <w:pPr>
-              <w:widowControl w:val="0"/>
-              <w:rPr>
-                <w:b w:val="0"/>
-                <w:bCs w:val="0"/>
-              </w:rPr>
-            </w:pPr>
-            <w:r>
-              <w:rPr>
-                <w:b w:val="0"/>
-                <w:bCs w:val="0"/>
-              </w:rPr>
-              <w:t>General Damages Due to Accident</w:t>
-            </w:r>
-          </w:p>
-        </w:tc>
-        <w:tc>
-          <w:tcPr>
-            <w:tcW w:w="4687" w:type="dxa"/>
-          </w:tcPr>
-          <w:p>
-            <w:pPr>
-              <w:cnfStyle w:val="000000100000" w:firstRow="0" w:lastRow="0" w:firstColumn="0" w:lastColumn="0" w:oddVBand="0" w:evenVBand="0" w:oddHBand="1" w:evenHBand="0" w:firstRowFirstColumn="0" w:firstRowLastColumn="0" w:lastRowFirstColumn="0" w:lastRowLastColumn="0"/>
-            </w:pPr>
-            <w:r>
-              <w:t>[VEHICLE 3 DAMAGES]</w:t>
-            </w:r>
-          </w:p>
-        </w:tc>
-      </w:tr>
-      <w:tr>
-        <w:trPr>
-          <w:trHeight w:val="560"/>
-        </w:trPr>
-        <w:tc>
-          <w:tcPr>
-            <w:cnfStyle w:val="001000000000" w:firstRow="0" w:lastRow="0" w:firstColumn="1" w:lastColumn="0" w:oddVBand="0" w:evenVBand="0" w:oddHBand="0" w:evenHBand="0" w:firstRowFirstColumn="0" w:firstRowLastColumn="0" w:lastRowFirstColumn="0" w:lastRowLastColumn="0"/>
-            <w:tcW w:w="4512" w:type="dxa"/>
-          </w:tcPr>
-          <w:p>
-            <w:pPr>
-              <w:widowControl w:val="0"/>
-              <w:rPr>
-                <w:b w:val="0"/>
-                <w:bCs w:val="0"/>
-              </w:rPr>
-            </w:pPr>
-            <w:r>
-              <w:rPr>
-                <w:b w:val="0"/>
-                <w:bCs w:val="0"/>
-              </w:rPr>
-              <w:lastRenderedPageBreak/>
-              <w:t>Speed Governor Functionality</w:t>
-            </w:r>
-          </w:p>
-        </w:tc>
-        <w:tc>
-          <w:tcPr>
-            <w:tcW w:w="4687" w:type="dxa"/>
-          </w:tcPr>
-          <w:p>
-            <w:pPr>
-              <w:cnfStyle w:val="000000000000" w:firstRow="0" w:lastRow="0" w:firstColumn="0" w:lastColumn="0" w:oddVBand="0" w:evenVBand="0" w:oddHBand="0" w:evenHBand="0" w:firstRowFirstColumn="0" w:firstRowLastColumn="0" w:lastRowFirstColumn="0" w:lastRowLastColumn="0"/>
-            </w:pPr>
-            <w:r>
-              <w:t>[VEHICLE 3 SPEED GOV]</w:t>
-            </w:r>
-          </w:p>
-        </w:tc>
-      </w:tr>
-      <w:tr>
-        <w:trPr>
-          <w:cnfStyle w:val="000000100000" w:firstRow="0" w:lastRow="0" w:firstColumn="0" w:lastColumn="0" w:oddVBand="0" w:evenVBand="0" w:oddHBand="1" w:evenHBand="0" w:firstRowFirstColumn="0" w:firstRowLastColumn="0" w:lastRowFirstColumn="0" w:lastRowLastColumn="0"/>
-          <w:trHeight w:val="288"/>
-        </w:trPr>
-        <w:tc>
-          <w:tcPr>
-            <w:cnfStyle w:val="001000000000" w:firstRow="0" w:lastRow="0" w:firstColumn="1" w:lastColumn="0" w:oddVBand="0" w:evenVBand="0" w:oddHBand="0" w:evenHBand="0" w:firstRowFirstColumn="0" w:firstRowLastColumn="0" w:lastRowFirstColumn="0" w:lastRowLastColumn="0"/>
-            <w:tcW w:w="4512" w:type="dxa"/>
-          </w:tcPr>
-          <w:p>
-            <w:pPr>
-              <w:widowControl w:val="0"/>
-              <w:rPr>
-                <w:b w:val="0"/>
-                <w:bCs w:val="0"/>
-              </w:rPr>
-            </w:pPr>
-            <w:r>
-              <w:rPr>
-                <w:b w:val="0"/>
-                <w:bCs w:val="0"/>
-              </w:rPr>
-              <w:t>KS 372 Compliance</w:t>
-            </w:r>
-          </w:p>
-        </w:tc>
-        <w:tc>
-          <w:tcPr>
-            <w:tcW w:w="4687" w:type="dxa"/>
-          </w:tcPr>
-          <w:p>
-            <w:pPr>
-              <w:cnfStyle w:val="000000100000" w:firstRow="0" w:lastRow="0" w:firstColumn="0" w:lastColumn="0" w:oddVBand="0" w:evenVBand="0" w:oddHBand="1" w:evenHBand="0" w:firstRowFirstColumn="0" w:firstRowLastColumn="0" w:lastRowFirstColumn="0" w:lastRowLastColumn="0"/>
-            </w:pPr>
-            <w:r>
-              <w:t>[VEHICLE 3 KS372]</w:t>
-            </w:r>
-          </w:p>
-        </w:tc>
-      </w:tr>
-      <w:tr>
-        <w:trPr>
-          <w:trHeight w:val="271"/>
-        </w:trPr>
-        <w:tc>
-          <w:tcPr>
-            <w:cnfStyle w:val="001000000000" w:firstRow="0" w:lastRow="0" w:firstColumn="1" w:lastColumn="0" w:oddVBand="0" w:evenVBand="0" w:oddHBand="0" w:evenHBand="0" w:firstRowFirstColumn="0" w:firstRowLastColumn="0" w:lastRowFirstColumn="0" w:lastRowLastColumn="0"/>
-            <w:tcW w:w="4512" w:type="dxa"/>
-          </w:tcPr>
-          <w:p>
-            <w:pPr>
-              <w:widowControl w:val="0"/>
-              <w:rPr>
-                <w:b w:val="0"/>
-                <w:bCs w:val="0"/>
-              </w:rPr>
-            </w:pPr>
-            <w:r>
-              <w:rPr>
-                <w:b w:val="0"/>
-                <w:bCs w:val="0"/>
-              </w:rPr>
-              <w:t>Insurance Details</w:t>
-            </w:r>
-          </w:p>
-        </w:tc>
-        <w:tc>
-          <w:tcPr>
-            <w:tcW w:w="4687" w:type="dxa"/>
-          </w:tcPr>
-          <w:p>
-            <w:pPr>
-              <w:cnfStyle w:val="000000000000" w:firstRow="0" w:lastRow="0" w:firstColumn="0" w:lastColumn="0" w:oddVBand="0" w:evenVBand="0" w:oddHBand="0" w:evenHBand="0" w:firstRowFirstColumn="0" w:firstRowLastColumn="0" w:lastRowFirstColumn="0" w:lastRowLastColumn="0"/>
-            </w:pPr>
-            <w:r>
-              <w:t>[VEHICLE 3 INSURANCE DETAILS]</w:t>
-            </w:r>
-          </w:p>
-        </w:tc>
-      </w:tr>
-      <w:tr>
-        <w:trPr>
-          <w:cnfStyle w:val="000000100000" w:firstRow="0" w:lastRow="0" w:firstColumn="0" w:lastColumn="0" w:oddVBand="0" w:evenVBand="0" w:oddHBand="1" w:evenHBand="0" w:firstRowFirstColumn="0" w:firstRowLastColumn="0" w:lastRowFirstColumn="0" w:lastRowLastColumn="0"/>
-          <w:trHeight w:val="288"/>
-        </w:trPr>
-        <w:tc>
-          <w:tcPr>
-            <w:cnfStyle w:val="001000000000" w:firstRow="0" w:lastRow="0" w:firstColumn="1" w:lastColumn="0" w:oddVBand="0" w:evenVBand="0" w:oddHBand="0" w:evenHBand="0" w:firstRowFirstColumn="0" w:firstRowLastColumn="0" w:lastRowFirstColumn="0" w:lastRowLastColumn="0"/>
-            <w:tcW w:w="4512" w:type="dxa"/>
-          </w:tcPr>
-          <w:p>
-            <w:pPr>
-              <w:widowControl w:val="0"/>
-              <w:rPr>
-                <w:b w:val="0"/>
-                <w:bCs w:val="0"/>
-              </w:rPr>
-            </w:pPr>
-            <w:r>
-              <w:rPr>
-                <w:b w:val="0"/>
-                <w:bCs w:val="0"/>
-              </w:rPr>
-              <w:t>Inspection Statu</w:t>
-            </w:r>
-            <w:r>
-              <w:rPr>
-                <w:b w:val="0"/>
-                <w:bCs w:val="0"/>
-              </w:rPr>
-              <w:t>s</w:t>
-            </w:r>
-          </w:p>
-        </w:tc>
-        <w:tc>
-          <w:tcPr>
-            <w:tcW w:w="4687" w:type="dxa"/>
-          </w:tcPr>
-          <w:p>
-            <w:pPr>
-              <w:cnfStyle w:val="000000100000" w:firstRow="0" w:lastRow="0" w:firstColumn="0" w:lastColumn="0" w:oddVBand="0" w:evenVBand="0" w:oddHBand="1" w:evenHBand="0" w:firstRowFirstColumn="0" w:firstRowLastColumn="0" w:lastRowFirstColumn="0" w:lastRowLastColumn="0"/>
-            </w:pPr>
-          </w:p>
-        </w:tc>
-      </w:tr>
-      <w:tr>
-        <w:trPr>
-          <w:trHeight w:val="271"/>
-        </w:trPr>
-        <w:tc>
-          <w:tcPr>
-            <w:cnfStyle w:val="001000000000" w:firstRow="0" w:lastRow="0" w:firstColumn="1" w:lastColumn="0" w:oddVBand="0" w:evenVBand="0" w:oddHBand="0" w:evenHBand="0" w:firstRowFirstColumn="0" w:firstRowLastColumn="0" w:lastRowFirstColumn="0" w:lastRowLastColumn="0"/>
-            <w:tcW w:w="4512" w:type="dxa"/>
-          </w:tcPr>
-          <w:p>
-            <w:pPr>
-              <w:widowControl w:val="0"/>
-              <w:rPr>
-                <w:b w:val="0"/>
-                <w:bCs w:val="0"/>
-              </w:rPr>
-            </w:pPr>
-            <w:r>
-              <w:rPr>
-                <w:b w:val="0"/>
-                <w:bCs w:val="0"/>
-              </w:rPr>
-              <w:t>Pre-accident details</w:t>
-            </w:r>
-          </w:p>
-        </w:tc>
-        <w:tc>
-          <w:tcPr>
-            <w:tcW w:w="4687" w:type="dxa"/>
-          </w:tcPr>
-          <w:p>
-            <w:pPr>
-              <w:cnfStyle w:val="000000000000" w:firstRow="0" w:lastRow="0" w:firstColumn="0" w:lastColumn="0" w:oddVBand="0" w:evenVBand="0" w:oddHBand="0" w:evenHBand="0" w:firstRowFirstColumn="0" w:firstRowLastColumn="0" w:lastRowFirstColumn="0" w:lastRowLastColumn="0"/>
-            </w:pPr>
-            <w:r>
-              <w:t>[VEHICLE 3 PRE_ACCIDENT]</w:t>
-            </w:r>
-          </w:p>
-        </w:tc>
-      </w:tr>
-      <w:tr>
-        <w:trPr>
-          <w:cnfStyle w:val="000000100000" w:firstRow="0" w:lastRow="0" w:firstColumn="0" w:lastColumn="0" w:oddVBand="0" w:evenVBand="0" w:oddHBand="1" w:evenHBand="0" w:firstRowFirstColumn="0" w:firstRowLastColumn="0" w:lastRowFirstColumn="0" w:lastRowLastColumn="0"/>
-          <w:trHeight w:val="271"/>
-        </w:trPr>
-        <w:tc>
-          <w:tcPr>
-            <w:cnfStyle w:val="001000000000" w:firstRow="0" w:lastRow="0" w:firstColumn="1" w:lastColumn="0" w:oddVBand="0" w:evenVBand="0" w:oddHBand="0" w:evenHBand="0" w:firstRowFirstColumn="0" w:firstRowLastColumn="0" w:lastRowFirstColumn="0" w:lastRowLastColumn="0"/>
-            <w:tcW w:w="4512" w:type="dxa"/>
-          </w:tcPr>
-          <w:p>
-            <w:pPr>
-              <w:widowControl w:val="0"/>
-              <w:rPr>
-                <w:b w:val="0"/>
-                <w:bCs w:val="0"/>
-              </w:rPr>
-            </w:pPr>
-          </w:p>
-        </w:tc>
-        <w:tc>
-          <w:tcPr>
-            <w:tcW w:w="4687" w:type="dxa"/>
-          </w:tcPr>
-          <w:p>
-            <w:pPr>
-              <w:cnfStyle w:val="000000100000" w:firstRow="0" w:lastRow="0" w:firstColumn="0" w:lastColumn="0" w:oddVBand="0" w:evenVBand="0" w:oddHBand="1" w:evenHBand="0" w:firstRowFirstColumn="0" w:firstRowLastColumn="0" w:lastRowFirstColumn="0" w:lastRowLastColumn="0"/>
-            </w:pPr>
-          </w:p>
-        </w:tc>
-      </w:tr>
-    </w:tbl>
-    <w:p>
-      <w:pPr>
-        <w:pStyle w:val="Heading2"/>
-      </w:pPr>
     </w:p>
     <w:p>
       <w:pPr>
@@ -2202,15 +1736,7 @@
           </w:tcPr>
           <w:p>
             <w:r>
-              <w:t xml:space="preserve">Drivers </w:t>
-            </w:r>
-            <w:proofErr w:type="gramStart"/>
-            <w:r>
-              <w:t>Name :</w:t>
-            </w:r>
-            <w:proofErr w:type="gramEnd"/>
-            <w:r>
-              <w:t xml:space="preserve"> </w:t>
+              <w:t xml:space="preserve">Drivers Name : </w:t>
             </w:r>
           </w:p>
         </w:tc>
@@ -2244,15 +1770,7 @@
           </w:tcPr>
           <w:p>
             <w:r>
-              <w:t xml:space="preserve">Drivers ID </w:t>
-            </w:r>
-            <w:proofErr w:type="gramStart"/>
-            <w:r>
-              <w:t>No :</w:t>
-            </w:r>
-            <w:proofErr w:type="gramEnd"/>
-            <w:r>
-              <w:t xml:space="preserve"> </w:t>
+              <w:t xml:space="preserve">Drivers ID No : </w:t>
             </w:r>
           </w:p>
         </w:tc>
@@ -2281,15 +1799,8 @@
           </w:tcPr>
           <w:p>
             <w:r>
-              <w:t xml:space="preserve"> Drivers DL </w:t>
-            </w:r>
-            <w:proofErr w:type="gramStart"/>
-            <w:r>
-              <w:t>No :</w:t>
-            </w:r>
-            <w:proofErr w:type="gramEnd"/>
-            <w:r>
-              <w:t xml:space="preserve"> </w:t>
+              <w:lastRenderedPageBreak/>
+              <w:t xml:space="preserve"> Drivers DL No : </w:t>
             </w:r>
           </w:p>
         </w:tc>
@@ -2357,13 +1868,8 @@
           </w:tcPr>
           <w:p>
             <w:r>
-              <w:t xml:space="preserve">Drivers </w:t>
-            </w:r>
-            <w:proofErr w:type="gramStart"/>
-            <w:r>
-              <w:t>Name :</w:t>
-            </w:r>
-            <w:proofErr w:type="gramEnd"/>
+              <w:t>Drivers Name :</w:t>
+            </w:r>
           </w:p>
         </w:tc>
         <w:tc>
@@ -2396,13 +1902,8 @@
           </w:tcPr>
           <w:p>
             <w:r>
-              <w:t xml:space="preserve">Drivers ID </w:t>
-            </w:r>
-            <w:proofErr w:type="gramStart"/>
-            <w:r>
-              <w:t>No :</w:t>
-            </w:r>
-            <w:proofErr w:type="gramEnd"/>
+              <w:t>Drivers ID No :</w:t>
+            </w:r>
           </w:p>
         </w:tc>
         <w:tc>
@@ -2430,13 +1931,8 @@
           </w:tcPr>
           <w:p>
             <w:r>
-              <w:t xml:space="preserve"> Drivers DL </w:t>
-            </w:r>
-            <w:proofErr w:type="gramStart"/>
-            <w:r>
-              <w:t>No :</w:t>
-            </w:r>
-            <w:proofErr w:type="gramEnd"/>
+              <w:t xml:space="preserve"> Drivers DL No :</w:t>
+            </w:r>
           </w:p>
         </w:tc>
         <w:tc>
@@ -2481,57 +1977,21 @@
           <w:sz w:val="28"/>
           <w:szCs w:val="28"/>
         </w:rPr>
-        <w:t>[Provide a detailed narrative reconstruction of the crash: date, time, vehicles involved, direction of travel, sequence of events leading up to the collision, actions of each driver, and how the impact occurred</w:t>
+        <w:t>[Provide a detailed narrative reconstruction of the crash: date, time, vehicles involved, direction of travel, sequence of events leading up to the collision, actions of each driver, and how the impact occurred.][Continue narrative: describe the point/nature of impact, resulting injuries and fatalities, casualty evacuation details (hospital name), outcome for other parties involved, and post-crash actions such as vehicle recovery and body transfer to mortuary.]</w:t>
       </w:r>
-      <w:proofErr w:type="gramStart"/>
+      <w:r>
+        <w:rPr>
+          <w:rFonts w:ascii="Calibri" w:hAnsi="Calibri"/>
+        </w:rPr>
+        <w:t xml:space="preserve"> </w:t>
+      </w:r>
       <w:r>
         <w:rPr>
           <w:rFonts w:ascii="Calibri" w:eastAsia="SimSun" w:hAnsi="Calibri" w:cs="SimSun"/>
           <w:sz w:val="28"/>
           <w:szCs w:val="28"/>
         </w:rPr>
-        <w:t>.][</w:t>
-      </w:r>
-      <w:proofErr w:type="gramEnd"/>
-      <w:r>
-        <w:rPr>
-          <w:rFonts w:ascii="Calibri" w:eastAsia="SimSun" w:hAnsi="Calibri" w:cs="SimSun"/>
-          <w:sz w:val="28"/>
-          <w:szCs w:val="28"/>
-        </w:rPr>
-        <w:t>Continue narrative: describe the point/nature of impact, resulting injuries and fatalities, casualty evacuation details (hospital name), outcome for other parties involved, and post-crash actions such as vehicle recovery and body transfer to mortuary.]</w:t>
-      </w:r>
-      <w:r>
-        <w:rPr>
-          <w:rFonts w:ascii="Calibri" w:hAnsi="Calibri"/>
-        </w:rPr>
-        <w:t xml:space="preserve"> </w:t>
-      </w:r>
-      <w:r>
-        <w:rPr>
-          <w:rFonts w:ascii="Calibri" w:eastAsia="SimSun" w:hAnsi="Calibri" w:cs="SimSun"/>
-          <w:sz w:val="28"/>
-          <w:szCs w:val="28"/>
-        </w:rPr>
-        <w:t xml:space="preserve">[Cause code]. [Case status, </w:t>
-      </w:r>
-      <w:proofErr w:type="gramStart"/>
-      <w:r>
-        <w:rPr>
-          <w:rFonts w:ascii="Calibri" w:eastAsia="SimSun" w:hAnsi="Calibri" w:cs="SimSun"/>
-          <w:sz w:val="28"/>
-          <w:szCs w:val="28"/>
-        </w:rPr>
-        <w:t>e.g.</w:t>
-      </w:r>
-      <w:proofErr w:type="gramEnd"/>
-      <w:r>
-        <w:rPr>
-          <w:rFonts w:ascii="Calibri" w:eastAsia="SimSun" w:hAnsi="Calibri" w:cs="SimSun"/>
-          <w:sz w:val="28"/>
-          <w:szCs w:val="28"/>
-        </w:rPr>
-        <w:t xml:space="preserve"> PUI/Closed].</w:t>
+        <w:t>[Cause code]. [Case status, e.g. PUI/Closed].</w:t>
       </w:r>
     </w:p>
     <w:p>
@@ -2547,7 +2007,6 @@
           <w:sz w:val="24"/>
           <w:szCs w:val="24"/>
         </w:rPr>
-        <w:lastRenderedPageBreak/>
         <w:t>PROBABLE CAUSE OF THE CRASH, CONTRIBUTING FACTORS, AND OBSERVATIONS</w:t>
       </w:r>
     </w:p>
@@ -2639,9 +2098,34 @@
     <w:p>
       <w:pPr>
         <w:pStyle w:val="Heading1"/>
+        <w:ind w:left="720"/>
+        <w:rPr>
+          <w:sz w:val="24"/>
+          <w:szCs w:val="24"/>
+        </w:rPr>
+      </w:pPr>
+      <w:r>
+        <w:rPr>
+          <w:b w:val="0"/>
+          <w:bCs w:val="0"/>
+        </w:rPr>
+        <w:t xml:space="preserve">B. </w:t>
+      </w:r>
+      <w:r>
+        <w:rPr>
+          <w:sz w:val="24"/>
+          <w:szCs w:val="24"/>
+        </w:rPr>
+        <w:t>CONTRIBUTING FACTORS, AND OBSERVATIONS</w:t>
+      </w:r>
+    </w:p>
+    <w:p/>
+    <w:p>
+      <w:pPr>
+        <w:pStyle w:val="Heading1"/>
         <w:numPr>
           <w:ilvl w:val="0"/>
-          <w:numId w:val="42"/>
+          <w:numId w:val="48"/>
         </w:numPr>
         <w:rPr>
           <w:rFonts w:ascii="Times New Roman" w:eastAsia="Times New Roman" w:hAnsi="Times New Roman" w:cs="Times New Roman"/>
@@ -2661,7 +2145,8 @@
           <w:sz w:val="22"/>
           <w:szCs w:val="22"/>
         </w:rPr>
-        <w:t>[Probable cause 4 -- describe.]</w:t>
+        <w:lastRenderedPageBreak/>
+        <w:t>[Contributing factor 1 -- describe.]</w:t>
       </w:r>
     </w:p>
     <w:p>
@@ -2669,7 +2154,7 @@
         <w:pStyle w:val="Heading1"/>
         <w:numPr>
           <w:ilvl w:val="0"/>
-          <w:numId w:val="42"/>
+          <w:numId w:val="48"/>
         </w:numPr>
         <w:rPr>
           <w:rFonts w:ascii="Times New Roman" w:eastAsia="Times New Roman" w:hAnsi="Times New Roman" w:cs="Times New Roman"/>
@@ -2689,7 +2174,7 @@
           <w:sz w:val="22"/>
           <w:szCs w:val="22"/>
         </w:rPr>
-        <w:t>[Probable cause 5 -- describe.]</w:t>
+        <w:t>[Contributing factor 2 -- describe.]</w:t>
       </w:r>
     </w:p>
     <w:p>
@@ -2697,7 +2182,7 @@
         <w:pStyle w:val="Heading1"/>
         <w:numPr>
           <w:ilvl w:val="0"/>
-          <w:numId w:val="42"/>
+          <w:numId w:val="48"/>
         </w:numPr>
         <w:rPr>
           <w:rFonts w:ascii="Times New Roman" w:eastAsia="Times New Roman" w:hAnsi="Times New Roman" w:cs="Times New Roman"/>
@@ -2717,257 +2202,7 @@
           <w:sz w:val="22"/>
           <w:szCs w:val="22"/>
         </w:rPr>
-        <w:t>[Probable cause 6 -- describe.]</w:t>
-      </w:r>
-    </w:p>
-    <w:p>
-      <w:pPr>
-        <w:pStyle w:val="Heading1"/>
-        <w:numPr>
-          <w:ilvl w:val="0"/>
-          <w:numId w:val="42"/>
-        </w:numPr>
-        <w:rPr>
-          <w:rFonts w:ascii="Times New Roman" w:eastAsia="Times New Roman" w:hAnsi="Times New Roman" w:cs="Times New Roman"/>
-          <w:b w:val="0"/>
-          <w:bCs w:val="0"/>
-          <w:color w:val="auto"/>
-          <w:sz w:val="22"/>
-          <w:szCs w:val="22"/>
-        </w:rPr>
-      </w:pPr>
-      <w:r>
-        <w:rPr>
-          <w:rFonts w:ascii="Times New Roman" w:eastAsia="Times New Roman" w:hAnsi="Times New Roman" w:cs="Times New Roman"/>
-          <w:b w:val="0"/>
-          <w:bCs w:val="0"/>
-          <w:color w:val="auto"/>
-          <w:sz w:val="22"/>
-          <w:szCs w:val="22"/>
-        </w:rPr>
-        <w:t>[Probable cause 7 -- describe.]</w:t>
-      </w:r>
-    </w:p>
-    <w:p>
-      <w:pPr>
-        <w:pStyle w:val="Heading1"/>
-        <w:ind w:left="720"/>
-        <w:rPr>
-          <w:sz w:val="24"/>
-          <w:szCs w:val="24"/>
-        </w:rPr>
-      </w:pPr>
-      <w:r>
-        <w:rPr>
-          <w:b w:val="0"/>
-          <w:bCs w:val="0"/>
-        </w:rPr>
-        <w:t xml:space="preserve">B. </w:t>
-      </w:r>
-      <w:r>
-        <w:rPr>
-          <w:sz w:val="24"/>
-          <w:szCs w:val="24"/>
-        </w:rPr>
-        <w:t>CONTRIBUTING FACTORS, AND OBSERVATIONS</w:t>
-      </w:r>
-    </w:p>
-    <w:p/>
-    <w:p>
-      <w:pPr>
-        <w:pStyle w:val="Heading1"/>
-        <w:numPr>
-          <w:ilvl w:val="0"/>
-          <w:numId w:val="48"/>
-        </w:numPr>
-        <w:rPr>
-          <w:rFonts w:ascii="Times New Roman" w:eastAsia="Times New Roman" w:hAnsi="Times New Roman" w:cs="Times New Roman"/>
-          <w:b w:val="0"/>
-          <w:bCs w:val="0"/>
-          <w:color w:val="auto"/>
-          <w:sz w:val="22"/>
-          <w:szCs w:val="22"/>
-        </w:rPr>
-      </w:pPr>
-      <w:r>
-        <w:rPr>
-          <w:rFonts w:ascii="Times New Roman" w:eastAsia="Times New Roman" w:hAnsi="Times New Roman" w:cs="Times New Roman"/>
-          <w:b w:val="0"/>
-          <w:bCs w:val="0"/>
-          <w:color w:val="auto"/>
-          <w:sz w:val="22"/>
-          <w:szCs w:val="22"/>
-        </w:rPr>
-        <w:lastRenderedPageBreak/>
-        <w:t>[Contributing factor 1 -- describe.]</w:t>
-      </w:r>
-    </w:p>
-    <w:p>
-      <w:pPr>
-        <w:pStyle w:val="Heading1"/>
-        <w:numPr>
-          <w:ilvl w:val="0"/>
-          <w:numId w:val="48"/>
-        </w:numPr>
-        <w:rPr>
-          <w:rFonts w:ascii="Times New Roman" w:eastAsia="Times New Roman" w:hAnsi="Times New Roman" w:cs="Times New Roman"/>
-          <w:b w:val="0"/>
-          <w:bCs w:val="0"/>
-          <w:color w:val="auto"/>
-          <w:sz w:val="22"/>
-          <w:szCs w:val="22"/>
-        </w:rPr>
-      </w:pPr>
-      <w:r>
-        <w:rPr>
-          <w:rFonts w:ascii="Times New Roman" w:eastAsia="Times New Roman" w:hAnsi="Times New Roman" w:cs="Times New Roman"/>
-          <w:b w:val="0"/>
-          <w:bCs w:val="0"/>
-          <w:color w:val="auto"/>
-          <w:sz w:val="22"/>
-          <w:szCs w:val="22"/>
-        </w:rPr>
-        <w:t>[Contributing factor 2 -- describe.]</w:t>
-      </w:r>
-    </w:p>
-    <w:p>
-      <w:pPr>
-        <w:pStyle w:val="Heading1"/>
-        <w:numPr>
-          <w:ilvl w:val="0"/>
-          <w:numId w:val="48"/>
-        </w:numPr>
-        <w:rPr>
-          <w:rFonts w:ascii="Times New Roman" w:eastAsia="Times New Roman" w:hAnsi="Times New Roman" w:cs="Times New Roman"/>
-          <w:b w:val="0"/>
-          <w:bCs w:val="0"/>
-          <w:color w:val="auto"/>
-          <w:sz w:val="22"/>
-          <w:szCs w:val="22"/>
-        </w:rPr>
-      </w:pPr>
-      <w:r>
-        <w:rPr>
-          <w:rFonts w:ascii="Times New Roman" w:eastAsia="Times New Roman" w:hAnsi="Times New Roman" w:cs="Times New Roman"/>
-          <w:b w:val="0"/>
-          <w:bCs w:val="0"/>
-          <w:color w:val="auto"/>
-          <w:sz w:val="22"/>
-          <w:szCs w:val="22"/>
-        </w:rPr>
         <w:t>[Contributing factor 3 -- describe.]</w:t>
-      </w:r>
-    </w:p>
-    <w:p>
-      <w:pPr>
-        <w:pStyle w:val="Heading1"/>
-        <w:numPr>
-          <w:ilvl w:val="0"/>
-          <w:numId w:val="48"/>
-        </w:numPr>
-        <w:rPr>
-          <w:rFonts w:ascii="Times New Roman" w:eastAsia="Times New Roman" w:hAnsi="Times New Roman" w:cs="Times New Roman"/>
-          <w:b w:val="0"/>
-          <w:bCs w:val="0"/>
-          <w:color w:val="auto"/>
-          <w:sz w:val="22"/>
-          <w:szCs w:val="22"/>
-        </w:rPr>
-      </w:pPr>
-      <w:r>
-        <w:rPr>
-          <w:rFonts w:ascii="Times New Roman" w:eastAsia="Times New Roman" w:hAnsi="Times New Roman" w:cs="Times New Roman"/>
-          <w:b w:val="0"/>
-          <w:bCs w:val="0"/>
-          <w:color w:val="auto"/>
-          <w:sz w:val="22"/>
-          <w:szCs w:val="22"/>
-        </w:rPr>
-        <w:t>[Contributing factor 4 -- describe.]</w:t>
-      </w:r>
-    </w:p>
-    <w:p>
-      <w:pPr>
-        <w:pStyle w:val="Heading1"/>
-        <w:numPr>
-          <w:ilvl w:val="0"/>
-          <w:numId w:val="48"/>
-        </w:numPr>
-        <w:rPr>
-          <w:rFonts w:ascii="Times New Roman" w:eastAsia="Times New Roman" w:hAnsi="Times New Roman" w:cs="Times New Roman"/>
-          <w:b w:val="0"/>
-          <w:bCs w:val="0"/>
-          <w:color w:val="auto"/>
-          <w:sz w:val="22"/>
-          <w:szCs w:val="22"/>
-        </w:rPr>
-      </w:pPr>
-      <w:r>
-        <w:rPr>
-          <w:rFonts w:ascii="Times New Roman" w:eastAsia="Times New Roman" w:hAnsi="Times New Roman" w:cs="Times New Roman"/>
-          <w:b w:val="0"/>
-          <w:bCs w:val="0"/>
-          <w:color w:val="auto"/>
-          <w:sz w:val="22"/>
-          <w:szCs w:val="22"/>
-        </w:rPr>
-        <w:t>[Contributing factor 5 -- describe.]</w:t>
-      </w:r>
-    </w:p>
-    <w:p>
-      <w:pPr>
-        <w:pStyle w:val="Heading1"/>
-        <w:numPr>
-          <w:ilvl w:val="0"/>
-          <w:numId w:val="48"/>
-        </w:numPr>
-        <w:rPr>
-          <w:rFonts w:ascii="Times New Roman" w:eastAsia="Times New Roman" w:hAnsi="Times New Roman" w:cs="Times New Roman"/>
-          <w:b w:val="0"/>
-          <w:bCs w:val="0"/>
-          <w:color w:val="auto"/>
-          <w:sz w:val="22"/>
-          <w:szCs w:val="22"/>
-        </w:rPr>
-      </w:pPr>
-      <w:r>
-        <w:rPr>
-          <w:rFonts w:ascii="Times New Roman" w:eastAsia="Times New Roman" w:hAnsi="Times New Roman" w:cs="Times New Roman"/>
-          <w:b w:val="0"/>
-          <w:bCs w:val="0"/>
-          <w:color w:val="auto"/>
-          <w:sz w:val="22"/>
-          <w:szCs w:val="22"/>
-        </w:rPr>
-        <w:t>[Contributing factor 6 -- describe.]</w:t>
-      </w:r>
-    </w:p>
-    <w:p>
-      <w:pPr>
-        <w:pStyle w:val="Heading1"/>
-        <w:numPr>
-          <w:ilvl w:val="0"/>
-          <w:numId w:val="48"/>
-        </w:numPr>
-        <w:rPr>
-          <w:rFonts w:ascii="Times New Roman" w:eastAsia="Times New Roman" w:hAnsi="Times New Roman" w:cs="Times New Roman"/>
-          <w:b w:val="0"/>
-          <w:bCs w:val="0"/>
-          <w:color w:val="auto"/>
-          <w:sz w:val="22"/>
-          <w:szCs w:val="22"/>
-        </w:rPr>
-      </w:pPr>
-      <w:r>
-        <w:rPr>
-          <w:rFonts w:ascii="Times New Roman" w:eastAsia="Times New Roman" w:hAnsi="Times New Roman" w:cs="Times New Roman"/>
-          <w:b w:val="0"/>
-          <w:bCs w:val="0"/>
-          <w:color w:val="auto"/>
-          <w:sz w:val="22"/>
-          <w:szCs w:val="22"/>
-        </w:rPr>
-        <w:t>[Contributing factor 7 -- describe.]</w:t>
       </w:r>
     </w:p>
     <w:p>
@@ -3036,79 +2271,12 @@
     </w:p>
     <w:p>
       <w:pPr>
-        <w:pStyle w:val="ListParagraph"/>
         <w:spacing w:line="276" w:lineRule="auto"/>
-        <w:ind w:left="720"/>
-      </w:pPr>
-    </w:p>
-    <w:p>
-      <w:pPr>
-        <w:pStyle w:val="ListParagraph"/>
-        <w:spacing w:line="276" w:lineRule="auto"/>
-        <w:ind w:left="720"/>
-      </w:pPr>
-      <w:r>
-        <w:t>4. [Recommendation 4.]</w:t>
-      </w:r>
-    </w:p>
-    <w:p>
-      <w:pPr>
-        <w:pStyle w:val="ListParagraph"/>
-        <w:spacing w:line="276" w:lineRule="auto"/>
-        <w:ind w:left="720"/>
-      </w:pPr>
-    </w:p>
-    <w:p>
-      <w:pPr>
-        <w:pStyle w:val="ListParagraph"/>
-        <w:spacing w:line="276" w:lineRule="auto"/>
-        <w:ind w:left="720"/>
-      </w:pPr>
-      <w:r>
-        <w:t>5. [Recommendation 5.]</w:t>
-      </w:r>
-    </w:p>
-    <w:p>
-      <w:pPr>
-        <w:pStyle w:val="ListParagraph"/>
-        <w:spacing w:line="276" w:lineRule="auto"/>
-        <w:ind w:left="720"/>
-      </w:pPr>
-    </w:p>
-    <w:p>
-      <w:pPr>
-        <w:pStyle w:val="ListParagraph"/>
-        <w:spacing w:line="276" w:lineRule="auto"/>
-        <w:ind w:left="720"/>
-      </w:pPr>
-      <w:r>
-        <w:t>6. [Recommendation 6.]</w:t>
-      </w:r>
-    </w:p>
-    <w:p>
-      <w:pPr>
-        <w:pStyle w:val="ListParagraph"/>
-        <w:spacing w:line="276" w:lineRule="auto"/>
-        <w:ind w:left="720"/>
-      </w:pPr>
-    </w:p>
-    <w:p>
-      <w:pPr>
-        <w:spacing w:line="276" w:lineRule="auto"/>
-        <w:ind w:left="360"/>
-      </w:pPr>
-      <w:r>
-        <w:t>7. [Recommendation 7.]</w:t>
-      </w:r>
-    </w:p>
-    <w:p>
-      <w:pPr>
-        <w:spacing w:line="276" w:lineRule="auto"/>
-        <w:ind w:left="360"/>
-      </w:pPr>
-      <w:r>
-        <w:t>8. [Recommendation 8.]</w:t>
-      </w:r>
+        <w:rPr>
+          <w:b/>
+          <w:bCs/>
+        </w:rPr>
+      </w:pPr>
     </w:p>
     <w:p>
       <w:pPr>
@@ -3129,38 +2297,26 @@
           <w:bCs/>
         </w:rPr>
       </w:pPr>
-    </w:p>
-    <w:p>
-      <w:pPr>
-        <w:spacing w:line="276" w:lineRule="auto"/>
-        <w:ind w:left="84"/>
+      <w:r>
         <w:rPr>
           <w:b/>
           <w:bCs/>
         </w:rPr>
-      </w:pPr>
+        <w:t>NB: Information sourced from [SOURCE</w:t>
+      </w:r>
       <w:r>
         <w:rPr>
           <w:b/>
           <w:bCs/>
         </w:rPr>
-        <w:t xml:space="preserve">NB: Information sourced from [SOURCE, </w:t>
+        <w:t>,</w:t>
       </w:r>
-      <w:proofErr w:type="gramStart"/>
       <w:r>
         <w:rPr>
           <w:b/>
           <w:bCs/>
         </w:rPr>
-        <w:t>e.g.</w:t>
-      </w:r>
-      <w:proofErr w:type="gramEnd"/>
-      <w:r>
-        <w:rPr>
-          <w:b/>
-          <w:bCs/>
-        </w:rPr>
-        <w:t xml:space="preserve"> XXX Traffic Police]</w:t>
+        <w:t xml:space="preserve"> Traffic Police]</w:t>
       </w:r>
     </w:p>
     <w:p>
@@ -3210,7 +2366,6 @@
           <w:b/>
           <w:bCs/>
         </w:rPr>
-        <w:lastRenderedPageBreak/>
         <w:t xml:space="preserve"> [INSPECTOR'S NAME]</w:t>
       </w:r>
     </w:p>
@@ -3247,7 +2402,7 @@
           <w:bCs/>
           <w:sz w:val="24"/>
         </w:rPr>
-        <w:t>Senior Motor Vehicle Inspector Kakamega MVI</w:t>
+        <w:t>Motor Vehicle Inspector Kakamega MVI</w:t>
       </w:r>
       <w:r>
         <w:rPr>
@@ -3256,16 +2411,6 @@
         </w:rPr>
         <w:t xml:space="preserve"> </w:t>
       </w:r>
-    </w:p>
-    <w:p>
-      <w:pPr>
-        <w:spacing w:line="360" w:lineRule="auto"/>
-        <w:jc w:val="both"/>
-        <w:rPr>
-          <w:sz w:val="24"/>
-          <w:szCs w:val="24"/>
-        </w:rPr>
-      </w:pPr>
     </w:p>
     <w:p>
       <w:pPr>
@@ -3290,7 +2435,6 @@
           <w:szCs w:val="24"/>
         </w:rPr>
       </w:pPr>
-      <w:proofErr w:type="spellStart"/>
       <w:r>
         <w:rPr>
           <w:b/>
@@ -3299,9 +2443,8 @@
           <w:sz w:val="24"/>
           <w:szCs w:val="24"/>
         </w:rPr>
-        <w:t>i</w:t>
+        <w:t>I</w:t>
       </w:r>
-      <w:proofErr w:type="spellEnd"/>
       <w:r>
         <w:rPr>
           <w:b/>
@@ -3312,7 +2455,7 @@
         </w:rPr>
         <w:t xml:space="preserve">. </w:t>
       </w:r>
-      <w:bookmarkStart w:id="1" w:name="_Hlk231147554"/>
+      <w:bookmarkStart w:id="0" w:name="_Hlk231147554"/>
       <w:r>
         <w:rPr>
           <w:b/>
@@ -3323,7 +2466,7 @@
         </w:rPr>
         <w:t>Photographic Evidence Related to the Motor vehicle</w:t>
       </w:r>
-      <w:bookmarkEnd w:id="1"/>
+      <w:bookmarkEnd w:id="0"/>
     </w:p>
     <w:p>
       <w:pPr>
@@ -3370,17 +2513,19 @@
           <w:color w:val="365F91"/>
         </w:rPr>
       </w:pPr>
-      <w:bookmarkStart w:id="2" w:name="_Hlk231147716"/>
-      <w:bookmarkStart w:id="3" w:name="_Hlk231147290"/>
+      <w:bookmarkStart w:id="1" w:name="_Hlk231147716"/>
+      <w:bookmarkStart w:id="2" w:name="_Hlk231147290"/>
       <w:r>
         <w:rPr>
           <w:i/>
           <w:iCs/>
           <w:color w:val="365F91"/>
         </w:rPr>
-        <w:t>FIG:1 [DESCRIPTION</w:t>
+        <w:t>FIG:1 [</w:t>
       </w:r>
-      <w:proofErr w:type="gramStart"/>
+      <w:r>
+        <w:t>VEHICLE 1 MAKE_MODEL</w:t>
+      </w:r>
       <w:r>
         <w:rPr>
           <w:i/>
@@ -3389,33 +2534,31 @@
         </w:rPr>
         <w:t>]</w:t>
       </w:r>
-      <w:bookmarkEnd w:id="2"/>
+      <w:bookmarkEnd w:id="1"/>
       <w:r>
         <w:rPr>
           <w:i/>
           <w:iCs/>
           <w:color w:val="365F91"/>
         </w:rPr>
-        <w:t>[</w:t>
+        <w:t>[VEHICLE</w:t>
       </w:r>
-      <w:proofErr w:type="gramEnd"/>
       <w:r>
         <w:rPr>
           <w:i/>
           <w:iCs/>
           <w:color w:val="365F91"/>
         </w:rPr>
-        <w:t>VEHICLE REG NO]</w:t>
+        <w:t xml:space="preserve"> 1</w:t>
       </w:r>
-    </w:p>
-    <w:p>
-      <w:pPr>
+      <w:r>
         <w:rPr>
           <w:i/>
           <w:iCs/>
           <w:color w:val="365F91"/>
         </w:rPr>
-      </w:pPr>
+        <w:t xml:space="preserve"> REG NO]</w:t>
+      </w:r>
     </w:p>
     <w:p>
       <w:pPr>
@@ -3426,7 +2569,16 @@
         </w:rPr>
       </w:pPr>
     </w:p>
-    <w:bookmarkEnd w:id="3"/>
+    <w:p>
+      <w:pPr>
+        <w:rPr>
+          <w:i/>
+          <w:iCs/>
+          <w:color w:val="365F91"/>
+        </w:rPr>
+      </w:pPr>
+    </w:p>
+    <w:bookmarkEnd w:id="2"/>
     <w:p>
       <w:pPr>
         <w:rPr>
@@ -3794,7 +2946,7 @@
           <w:szCs w:val="18"/>
         </w:rPr>
       </w:pPr>
-      <w:bookmarkStart w:id="4" w:name="_Hlk231147329"/>
+      <w:bookmarkStart w:id="3" w:name="_Hlk231147329"/>
       <w:r>
         <w:rPr>
           <w:i/>
@@ -3803,9 +2955,17 @@
           <w:sz w:val="18"/>
           <w:szCs w:val="18"/>
         </w:rPr>
-        <w:t>FIG:2 [DESCRIPTION</w:t>
+        <w:t>FIG:2 [</w:t>
       </w:r>
-      <w:proofErr w:type="gramStart"/>
+      <w:r>
+        <w:t xml:space="preserve">VEHICLE </w:t>
+      </w:r>
+      <w:r>
+        <w:t>2</w:t>
+      </w:r>
+      <w:r>
+        <w:t xml:space="preserve"> MAKE_MODEL</w:t>
+      </w:r>
       <w:r>
         <w:rPr>
           <w:i/>
@@ -3816,23 +2976,30 @@
         </w:rPr>
         <w:t>]</w:t>
       </w:r>
-      <w:bookmarkEnd w:id="4"/>
+      <w:bookmarkEnd w:id="3"/>
       <w:r>
         <w:rPr>
           <w:i/>
           <w:iCs/>
           <w:color w:val="365F91"/>
         </w:rPr>
-        <w:t>[</w:t>
+        <w:t>[VEHICLE</w:t>
       </w:r>
-      <w:proofErr w:type="gramEnd"/>
       <w:r>
         <w:rPr>
           <w:i/>
           <w:iCs/>
           <w:color w:val="365F91"/>
         </w:rPr>
-        <w:t>VEHICLE REG NO]</w:t>
+        <w:t xml:space="preserve"> 2</w:t>
+      </w:r>
+      <w:r>
+        <w:rPr>
+          <w:i/>
+          <w:iCs/>
+          <w:color w:val="365F91"/>
+        </w:rPr>
+        <w:t xml:space="preserve"> REG NO]</w:t>
       </w:r>
     </w:p>
     <w:p>
@@ -3907,140 +3074,6 @@
           <w:sz w:val="18"/>
           <w:szCs w:val="18"/>
         </w:rPr>
-      </w:pPr>
-    </w:p>
-    <w:p>
-      <w:pPr>
-        <w:rPr>
-          <w:noProof/>
-          <w:sz w:val="18"/>
-          <w:szCs w:val="18"/>
-        </w:rPr>
-      </w:pPr>
-    </w:p>
-    <w:p>
-      <w:pPr>
-        <w:rPr>
-          <w:noProof/>
-          <w:sz w:val="18"/>
-          <w:szCs w:val="18"/>
-        </w:rPr>
-      </w:pPr>
-    </w:p>
-    <w:p>
-      <w:pPr>
-        <w:rPr>
-          <w:noProof/>
-          <w:sz w:val="18"/>
-          <w:szCs w:val="18"/>
-        </w:rPr>
-      </w:pPr>
-    </w:p>
-    <w:p>
-      <w:pPr>
-        <w:rPr>
-          <w:noProof/>
-          <w:sz w:val="18"/>
-          <w:szCs w:val="18"/>
-        </w:rPr>
-      </w:pPr>
-    </w:p>
-    <w:p>
-      <w:pPr>
-        <w:rPr>
-          <w:noProof/>
-          <w:sz w:val="18"/>
-          <w:szCs w:val="18"/>
-        </w:rPr>
-      </w:pPr>
-    </w:p>
-    <w:p>
-      <w:pPr>
-        <w:rPr>
-          <w:noProof/>
-          <w:sz w:val="18"/>
-          <w:szCs w:val="18"/>
-        </w:rPr>
-      </w:pPr>
-    </w:p>
-    <w:p>
-      <w:pPr>
-        <w:rPr>
-          <w:noProof/>
-          <w:sz w:val="18"/>
-          <w:szCs w:val="18"/>
-        </w:rPr>
-      </w:pPr>
-    </w:p>
-    <w:p>
-      <w:pPr>
-        <w:rPr>
-          <w:noProof/>
-          <w:sz w:val="18"/>
-          <w:szCs w:val="18"/>
-        </w:rPr>
-      </w:pPr>
-    </w:p>
-    <w:p>
-      <w:pPr>
-        <w:rPr>
-          <w:noProof/>
-          <w:sz w:val="18"/>
-          <w:szCs w:val="18"/>
-        </w:rPr>
-      </w:pPr>
-    </w:p>
-    <w:p>
-      <w:pPr>
-        <w:rPr>
-          <w:noProof/>
-          <w:sz w:val="18"/>
-          <w:szCs w:val="18"/>
-        </w:rPr>
-      </w:pPr>
-    </w:p>
-    <w:p>
-      <w:pPr>
-        <w:rPr>
-          <w:noProof/>
-          <w:sz w:val="18"/>
-          <w:szCs w:val="18"/>
-        </w:rPr>
-      </w:pPr>
-    </w:p>
-    <w:p>
-      <w:pPr>
-        <w:rPr>
-          <w:noProof/>
-          <w:sz w:val="18"/>
-          <w:szCs w:val="18"/>
-        </w:rPr>
-      </w:pPr>
-    </w:p>
-    <w:p/>
-    <w:p>
-      <w:pPr>
-        <w:widowControl/>
-        <w:spacing w:before="100" w:beforeAutospacing="1" w:after="100" w:afterAutospacing="1"/>
-        <w:rPr>
-          <w:sz w:val="24"/>
-          <w:szCs w:val="24"/>
-        </w:rPr>
-      </w:pPr>
-    </w:p>
-    <w:p>
-      <w:pPr>
-        <w:rPr>
-          <w:noProof/>
-          <w:sz w:val="18"/>
-          <w:szCs w:val="18"/>
-        </w:rPr>
-      </w:pPr>
-    </w:p>
-    <w:p/>
-    <w:p>
-      <w:pPr>
-        <w:pStyle w:val="Caption"/>
       </w:pPr>
     </w:p>
     <w:p>
@@ -4226,97 +3259,16 @@
     <w:p>
       <w:pPr>
         <w:rPr>
-          <w:color w:val="548DD4"/>
-        </w:rPr>
-      </w:pPr>
-    </w:p>
-    <w:p>
-      <w:pPr>
-        <w:rPr>
           <w:rStyle w:val="IntenseEmphasis"/>
         </w:rPr>
       </w:pPr>
     </w:p>
     <w:p>
       <w:pPr>
-        <w:rPr>
-          <w:rStyle w:val="IntenseEmphasis"/>
-        </w:rPr>
-      </w:pPr>
-    </w:p>
-    <w:p>
-      <w:pPr>
-        <w:rPr>
-          <w:rStyle w:val="IntenseEmphasis"/>
-        </w:rPr>
-      </w:pPr>
-    </w:p>
-    <w:p>
-      <w:pPr>
-        <w:rPr>
-          <w:rStyle w:val="IntenseEmphasis"/>
-        </w:rPr>
-      </w:pPr>
-    </w:p>
-    <w:p>
-      <w:pPr>
-        <w:rPr>
-          <w:rStyle w:val="IntenseEmphasis"/>
-        </w:rPr>
-      </w:pPr>
-    </w:p>
-    <w:p>
-      <w:pPr>
-        <w:rPr>
-          <w:rStyle w:val="IntenseEmphasis"/>
-        </w:rPr>
-      </w:pPr>
-    </w:p>
-    <w:p>
-      <w:pPr>
-        <w:rPr>
-          <w:rStyle w:val="IntenseEmphasis"/>
-        </w:rPr>
-      </w:pPr>
-    </w:p>
-    <w:p>
-      <w:pPr>
-        <w:rPr>
-          <w:rStyle w:val="IntenseEmphasis"/>
-        </w:rPr>
-      </w:pPr>
-    </w:p>
-    <w:p>
-      <w:pPr>
-        <w:rPr>
-          <w:rStyle w:val="IntenseEmphasis"/>
-        </w:rPr>
-      </w:pPr>
-    </w:p>
-    <w:p>
-      <w:pPr>
-        <w:rPr>
-          <w:rStyle w:val="IntenseEmphasis"/>
-        </w:rPr>
-      </w:pPr>
-    </w:p>
-    <w:p/>
-    <w:p>
-      <w:pPr>
-        <w:rPr>
-          <w:rStyle w:val="IntenseEmphasis"/>
-        </w:rPr>
-      </w:pPr>
-    </w:p>
-    <w:p>
-      <w:pPr>
         <w:tabs>
           <w:tab w:val="left" w:pos="2145"/>
         </w:tabs>
       </w:pPr>
-      <w:r>
-        <w:tab/>
-      </w:r>
     </w:p>
     <w:sectPr>
       <w:headerReference w:type="default" r:id="rId8"/>
@@ -11093,6 +10045,7 @@
   <w:style w:type="paragraph" w:default="1" w:styleId="Normal">
     <w:name w:val="Normal"/>
     <w:qFormat/>
+    <w:rsid w:val="00342438"/>
     <w:rPr>
       <w:rFonts w:ascii="Times New Roman" w:eastAsia="Times New Roman" w:hAnsi="Times New Roman" w:cs="Times New Roman"/>
     </w:rPr>

</xml_diff>